<commit_message>
docs(testing): update terminal screenshots and test cases to match exact reference format
</commit_message>
<xml_diff>
--- a/docs/testing/PORTIDE_Selenium_Test_Report.docx
+++ b/docs/testing/PORTIDE_Selenium_Test_Report.docx
@@ -138,7 +138,7 @@
       <w:r>
         <w:drawing>
           <wp:inline xmlns:a="http://schemas.openxmlformats.org/drawingml/2006/main" xmlns:pic="http://schemas.openxmlformats.org/drawingml/2006/picture">
-            <wp:extent cx="5669280" cy="2286000"/>
+            <wp:extent cx="5669280" cy="1503114"/>
             <wp:docPr id="1" name="Picture 1"/>
             <wp:cNvGraphicFramePr>
               <a:graphicFrameLocks noChangeAspect="1"/>
@@ -159,7 +159,7 @@
                   <pic:spPr>
                     <a:xfrm>
                       <a:off x="0" y="0"/>
-                      <a:ext cx="5669280" cy="2286000"/>
+                      <a:ext cx="5669280" cy="1503114"/>
                     </a:xfrm>
                     <a:prstGeom prst="rect"/>
                   </pic:spPr>
@@ -1714,7 +1714,7 @@
       <w:r>
         <w:drawing>
           <wp:inline xmlns:a="http://schemas.openxmlformats.org/drawingml/2006/main" xmlns:pic="http://schemas.openxmlformats.org/drawingml/2006/picture">
-            <wp:extent cx="5669280" cy="2148840"/>
+            <wp:extent cx="5669280" cy="1410878"/>
             <wp:docPr id="2" name="Picture 2"/>
             <wp:cNvGraphicFramePr>
               <a:graphicFrameLocks noChangeAspect="1"/>
@@ -1735,7 +1735,7 @@
                   <pic:spPr>
                     <a:xfrm>
                       <a:off x="0" y="0"/>
-                      <a:ext cx="5669280" cy="2148840"/>
+                      <a:ext cx="5669280" cy="1410878"/>
                     </a:xfrm>
                     <a:prstGeom prst="rect"/>
                   </pic:spPr>
@@ -3127,7 +3127,7 @@
       <w:r>
         <w:drawing>
           <wp:inline xmlns:a="http://schemas.openxmlformats.org/drawingml/2006/main" xmlns:pic="http://schemas.openxmlformats.org/drawingml/2006/picture">
-            <wp:extent cx="5669280" cy="2148840"/>
+            <wp:extent cx="5669280" cy="1423821"/>
             <wp:docPr id="3" name="Picture 3"/>
             <wp:cNvGraphicFramePr>
               <a:graphicFrameLocks noChangeAspect="1"/>
@@ -3148,7 +3148,7 @@
                   <pic:spPr>
                     <a:xfrm>
                       <a:off x="0" y="0"/>
-                      <a:ext cx="5669280" cy="2148840"/>
+                      <a:ext cx="5669280" cy="1423821"/>
                     </a:xfrm>
                     <a:prstGeom prst="rect"/>
                   </pic:spPr>
@@ -4542,7 +4542,7 @@
       <w:r>
         <w:drawing>
           <wp:inline xmlns:a="http://schemas.openxmlformats.org/drawingml/2006/main" xmlns:pic="http://schemas.openxmlformats.org/drawingml/2006/picture">
-            <wp:extent cx="5669280" cy="2148840"/>
+            <wp:extent cx="5669280" cy="1398167"/>
             <wp:docPr id="4" name="Picture 4"/>
             <wp:cNvGraphicFramePr>
               <a:graphicFrameLocks noChangeAspect="1"/>
@@ -4563,7 +4563,7 @@
                   <pic:spPr>
                     <a:xfrm>
                       <a:off x="0" y="0"/>
-                      <a:ext cx="5669280" cy="2148840"/>
+                      <a:ext cx="5669280" cy="1398167"/>
                     </a:xfrm>
                     <a:prstGeom prst="rect"/>
                   </pic:spPr>
@@ -5950,7 +5950,7 @@
       <w:r>
         <w:drawing>
           <wp:inline xmlns:a="http://schemas.openxmlformats.org/drawingml/2006/main" xmlns:pic="http://schemas.openxmlformats.org/drawingml/2006/picture">
-            <wp:extent cx="5669280" cy="2148840"/>
+            <wp:extent cx="5669280" cy="1410878"/>
             <wp:docPr id="5" name="Picture 5"/>
             <wp:cNvGraphicFramePr>
               <a:graphicFrameLocks noChangeAspect="1"/>
@@ -5971,7 +5971,7 @@
                   <pic:spPr>
                     <a:xfrm>
                       <a:off x="0" y="0"/>
-                      <a:ext cx="5669280" cy="2148840"/>
+                      <a:ext cx="5669280" cy="1410878"/>
                     </a:xfrm>
                     <a:prstGeom prst="rect"/>
                   </pic:spPr>

</xml_diff>